<commit_message>
Align demo lesson core words with RAZ aa Toys book (bear/kite/robot, drum/kite/robot)
Co-authored-by: Francis <earthonliner@users.noreply.github.com>
</commit_message>
<xml_diff>
--- a/lesson-plans/demo-lesson-starter-toys.docx
+++ b/lesson-plans/demo-lesson-starter-toys.docx
@@ -225,7 +225,7 @@
                 <w:b w:val="0"/>
                 <w:sz w:val="18"/>
               </w:rPr>
-              <w:t>知道 B 的名字是 bee、声音是 /b/；能把 ball、balloon、bear、teddy、truck、top 分到 /b/ 篮子或 /t/ 篮子</w:t>
+              <w:t>知道 B 的名字是 bee、声音是 /b/；能把 ball、balloon、bear、blocks、teddy、top 分到 /b/ 篮子或 /t/ 篮子</w:t>
             </w:r>
           </w:p>
         </w:tc>
@@ -281,7 +281,7 @@
                 <w:b w:val="0"/>
                 <w:sz w:val="18"/>
               </w:rPr>
-              <w:t>跟着指读 RAZ aa《Toys》，自己读出 1 页 "The ball."</w:t>
+              <w:t>跟着指读 RAZ aa《Toys》，自己读出 1 页 "The bear." / "The kite." / "The robot."</w:t>
             </w:r>
           </w:p>
         </w:tc>
@@ -447,7 +447,7 @@
                 <w:b w:val="0"/>
                 <w:sz w:val="18"/>
               </w:rPr>
-              <w:t>ball, balloon, teddy bear, doll, truck, top（陀螺）</w:t>
+              <w:t>ball, balloon, teddy bear, kite, robot, top（陀螺）</w:t>
             </w:r>
           </w:p>
         </w:tc>
@@ -465,7 +465,7 @@
                 <w:b w:val="0"/>
                 <w:sz w:val="18"/>
               </w:rPr>
-              <w:t>6 个，每个有实物；Starter p.20–21 的 8 词里去掉 kite、car、robot，加入 top 为 /t/ 服务</w:t>
+              <w:t>6 个，每个有实物；Starter p.20–21 的 8 词里去掉 doll、car、truck，加入 top 为 /t/ 服务。其中 bear、kite、robot 三个词同时出现在绘本《Toys》里（the bear, the kite, the robot）</w:t>
             </w:r>
           </w:p>
         </w:tc>
@@ -503,7 +503,7 @@
                 <w:b w:val="0"/>
                 <w:sz w:val="18"/>
               </w:rPr>
-              <w:t>kite, car, robot（出现在绘本或 Starter 大图中时顺带说）</w:t>
+              <w:t>绘本里的另外 5 个词：blocks, paint, drum, plane, wagon；Starter 大图里的 doll, car, truck</w:t>
             </w:r>
           </w:p>
         </w:tc>
@@ -521,7 +521,7 @@
                 <w:b w:val="0"/>
                 <w:sz w:val="18"/>
               </w:rPr>
-              <w:t>不考</w:t>
+              <w:t>老师读、孩子指图即可，不考</w:t>
             </w:r>
           </w:p>
         </w:tc>
@@ -615,7 +615,7 @@
                 <w:b w:val="0"/>
                 <w:sz w:val="18"/>
               </w:rPr>
-              <w:t>/b/：ball, balloon, bear, bus, book　/t/：teddy, truck, top, ten, table</w:t>
+              <w:t>/b/：ball, balloon, bear, bus, book　/t/：teddy, top, ten, table, truck（图卡）</w:t>
             </w:r>
           </w:p>
         </w:tc>
@@ -727,7 +727,7 @@
                 <w:b w:val="0"/>
                 <w:sz w:val="18"/>
               </w:rPr>
-              <w:t>RAZ aa《Toys》："The ___."（ball, doll, car, truck, teddy bear…）</w:t>
+              <w:t>RAZ aa《Toys》8 页：the blocks, the bear, the paint, the drum, the plane, the wagon, the kite, the robot</w:t>
             </w:r>
           </w:p>
         </w:tc>
@@ -745,7 +745,7 @@
                 <w:b w:val="0"/>
                 <w:sz w:val="18"/>
               </w:rPr>
-              <w:t>高频词 the；指读</w:t>
+              <w:t>高频词 the；指读；bear / kite / robot 三页是孩子要能独立读出的页</w:t>
             </w:r>
           </w:p>
         </w:tc>
@@ -951,7 +951,7 @@
                 <w:b w:val="0"/>
                 <w:sz w:val="17"/>
               </w:rPr>
-              <w:t>玩具小卡车（truck）×1</w:t>
+              <w:t>小风筝（kite）×1（迷你风筝或风筝形状的挂件 / 卡纸风筝均可）</w:t>
             </w:r>
           </w:p>
           <w:p>
@@ -963,7 +963,7 @@
                 <w:b w:val="0"/>
                 <w:sz w:val="17"/>
               </w:rPr>
-              <w:t>娃娃（doll）×1，30 cm 左右</w:t>
+              <w:t>玩具机器人（robot）×1，会走或发光更好</w:t>
             </w:r>
           </w:p>
           <w:p>
@@ -1416,7 +1416,7 @@
                 <w:b w:val="0"/>
                 <w:sz w:val="17"/>
               </w:rPr>
-              <w:t>ball, balloon, teddy bear, doll, truck, top</w:t>
+              <w:t>ball, balloon, teddy bear, kite, robot, top</w:t>
             </w:r>
           </w:p>
         </w:tc>
@@ -2617,7 +2617,7 @@
                 <w:color w:val="8A5A00"/>
                 <w:sz w:val="17"/>
               </w:rPr>
-              <w:t>※ 出场顺序：ball → balloon（相似音开头，顺势说"都是 b 开头"但先不展开）→ teddy bear → doll → truck → top（陀螺当场转一下，孩子会尖叫，这个词记得最牢）</w:t>
+              <w:t>※ 出场顺序：ball → balloon（相似音开头，顺势说"都是 b 开头"但先不展开）→ teddy bear → kite（举高做放风筝动作）→ robot（机器人走路，孩子跟学）→ top（陀螺当场转一下，孩子会尖叫，这个词记得最牢）</w:t>
             </w:r>
           </w:p>
           <w:p>
@@ -3082,7 +3082,7 @@
                 <w:b w:val="0"/>
                 <w:sz w:val="17"/>
               </w:rPr>
-              <w:t>玩具放回袋子，老师只摸不看："Is it a teddy bear?"（点头手势）"Yes, it is!" 再摸："Is it a ball? …No, it isn't. It's a doll."（摇头手势）示范 3 次，让孩子跟说 Yes, it is. / No, it isn't. 各 3 遍</w:t>
+              <w:t>玩具放回袋子，老师只摸不看："Is it a teddy bear?"（点头手势）"Yes, it is!" 再摸："Is it a ball? …No, it isn't. It's a robot."（摇头手势）示范 3 次，让孩子跟说 Yes, it is. / No, it isn't. 各 3 遍</w:t>
             </w:r>
           </w:p>
         </w:tc>
@@ -3421,7 +3421,7 @@
                 <w:b w:val="0"/>
                 <w:sz w:val="17"/>
               </w:rPr>
-              <w:t>揭开 Tt："Name: T. Sound: /t/ /t/ /t/."（手指放唇前感受气流）"teddy—/t/! truck—/t/! top—/t/!"（再转一下陀螺）</w:t>
+              <w:t>揭开 Tt："Name: T. Sound: /t/ /t/ /t/."（手指放唇前感受气流）"teddy—/t/! top—/t/! ten—/t/!"（举 10 根手指）（再转一下陀螺）</w:t>
             </w:r>
           </w:p>
         </w:tc>
@@ -3496,7 +3496,7 @@
                 <w:b w:val="0"/>
                 <w:sz w:val="17"/>
               </w:rPr>
-              <w:t>地上两个篮子。老师举玩具或词卡说词："ball… /b/ or /t/?" 孩子齐说音，再请一人把它放进篮子。10 个词：ball, balloon, bear, bus（图卡）, book（实物）/ teddy, truck, top, ten（手指）, table（拍桌子）</w:t>
+              <w:t>地上两个篮子。老师举玩具或词卡说词："ball… /b/ or /t/?" 孩子齐说音，再请一人把它放进篮子。10 个词：ball, balloon, bear, blocks（翻开绘本第 1 页）, book（实物）/ teddy, top, ten（手指）, table（拍桌子）, truck（图卡）</w:t>
             </w:r>
           </w:p>
         </w:tc>
@@ -3910,7 +3910,7 @@
                 <w:b w:val="0"/>
                 <w:sz w:val="17"/>
               </w:rPr>
-              <w:t>逐页用手指指着每个词读："The… ball."（the 轻、ball 重）每页读 2 遍，第 2 遍读 "The…" 停住让孩子接玩具词</w:t>
+              <w:t>逐页用手指指着每个词读："The… blocks."（the 轻、blocks 重）每页读 2 遍，第 2 遍读 "The…" 停住：bear / kite / robot 三页让孩子接词，其余 5 页（blocks, paint, drum, plane, wagon）老师自己读出并用动作演示（搭积木、刷油漆、敲鼓、飞机飞、拉车）</w:t>
             </w:r>
           </w:p>
         </w:tc>
@@ -3928,7 +3928,7 @@
                 <w:b w:val="0"/>
                 <w:sz w:val="17"/>
               </w:rPr>
-              <w:t>接词：ball! doll! truck!…</w:t>
+              <w:t>接词：bear! kite! robot!；其他页跟做动作</w:t>
             </w:r>
           </w:p>
         </w:tc>
@@ -3947,7 +3947,7 @@
                 <w:color w:val="8A5A00"/>
                 <w:sz w:val="17"/>
               </w:rPr>
-              <w:t>※ 书中如有未学词（如 kite, car），老师直接读出，不停下来教</w:t>
+              <w:t>※ 不教也不考那 5 个词，只让孩子"听懂并指"；这正是绘本"接触自然语言"的作用——书里有课堂之外的词，很正常</w:t>
             </w:r>
           </w:p>
         </w:tc>
@@ -4135,7 +4135,7 @@
                 <w:b w:val="0"/>
                 <w:sz w:val="17"/>
               </w:rPr>
-              <w:t>"Find /b/ toys in the book!"（ball, bear）"Find /t/ toys!"（truck, top, teddy）孩子翻书找并贴小星星</w:t>
+              <w:t>"Find /b/ toys in the book!"（bear, blocks——两页）"Where's the /t/…? No /t/ toys in this book!"（孩子发现没有，老师拿出陀螺："But we have a top!"）孩子翻书找并贴小星星</w:t>
             </w:r>
           </w:p>
         </w:tc>
@@ -4474,7 +4474,7 @@
                 <w:b w:val="0"/>
                 <w:sz w:val="17"/>
               </w:rPr>
-              <w:t>每人 30–40 秒：老师问 "What is it?" → 孩子答整句 → 老师举书翻到对应玩具页 → 孩子读 "The ___." → 全班鼓掌说 "Yes! It's a ___!" → 发贴纸贴到奖状卡</w:t>
+              <w:t>每人 30–40 秒：老师问 "What is it?" → 孩子答整句 → 老师举书：拿 bear / kite / robot 的孩子翻到对应页读 "The ___."，拿 ball / balloon / top 的孩子任选 bear、kite、robot 一页读 → 全班鼓掌说 "Yes! It's a ___!" → 发贴纸贴到奖状卡</w:t>
             </w:r>
           </w:p>
         </w:tc>
@@ -4860,6 +4860,72 @@
         <w:spacing w:after="40"/>
       </w:pPr>
     </w:p>
+    <w:tbl>
+      <w:tblPr>
+        <w:tblStyle w:val="TableGrid"/>
+        <w:tblW w:type="auto" w:w="0"/>
+        <w:tblLook w:firstColumn="1" w:firstRow="1" w:lastColumn="0" w:lastRow="0" w:noHBand="0" w:noVBand="1" w:val="04A0"/>
+      </w:tblPr>
+      <w:tblGrid>
+        <w:gridCol w:w="9978"/>
+      </w:tblGrid>
+      <w:tr>
+        <w:tc>
+          <w:tcPr>
+            <w:tcW w:type="dxa" w:w="9978"/>
+            <w:shd w:val="clear" w:color="auto" w:fill="FFF9E6"/>
+          </w:tcPr>
+          <w:p>
+            <w:r/>
+            <w:r>
+              <w:rPr>
+                <w:b/>
+                <w:sz w:val="20"/>
+              </w:rPr>
+              <w:t>关于绘本《Toys》与课堂词的重合度</w:t>
+            </w:r>
+          </w:p>
+          <w:p>
+            <w:pPr>
+              <w:spacing w:after="20"/>
+            </w:pPr>
+            <w:r>
+              <w:rPr>
+                <w:sz w:val="19"/>
+              </w:rPr>
+              <w:t>《Toys》8 页：the blocks, the bear, the paint, the drum, the plane, the wagon, the kite, the robot。与本课 6 个核心词重合 3 个（bear, kite, robot），因此核心词已按绘本调整（去掉 doll、truck，换成 kite、robot）。</w:t>
+            </w:r>
+          </w:p>
+          <w:p>
+            <w:pPr>
+              <w:spacing w:after="20"/>
+            </w:pPr>
+            <w:r>
+              <w:rPr>
+                <w:sz w:val="19"/>
+              </w:rPr>
+              <w:t>其余 5 个词处理：老师读 + 动作演示，孩子听懂并指图，不说不考。aa 级分级读物的作用本来就是"接触课堂之外的自然语言"，一本书里有一半词课上没教过是正常状态；孩子能读出的是句式 The ___. 和自己认识的 3 页，这就足够有成就感。</w:t>
+            </w:r>
+          </w:p>
+          <w:p>
+            <w:pPr>
+              <w:spacing w:after="20"/>
+            </w:pPr>
+            <w:r>
+              <w:rPr>
+                <w:sz w:val="19"/>
+              </w:rPr>
+              <w:t>为什么不换书：RAZ aa 级里以玩具为主题的只有这一本；换成其他 aa 书（Big / Little / The Classroom 等）话题就对不上道具。若希望重合度更高，可在课后把孩子"玩具秀"的照片做成一本 8 页的班级小书《Our Toys》（The ball. The balloon. The top.…）作为第 2 次课的朗读材料。</w:t>
+            </w:r>
+          </w:p>
+        </w:tc>
+      </w:tr>
+    </w:tbl>
+    <w:p>
+      <w:pPr>
+        <w:spacing w:after="40"/>
+      </w:pPr>
+    </w:p>
     <w:p>
       <w:pPr>
         <w:spacing w:before="240" w:after="80"/>
@@ -5181,7 +5247,7 @@
         <w:rPr>
           <w:sz w:val="19"/>
         </w:rPr>
-        <w:t>今天学了：ball, balloon, teddy bear, doll, truck, top；句子 What is it? It's a ___. / Is it a…? Yes, it is. / No, it isn't.；字母声音 B = /b/，T = /t/；绘本《Toys》。</w:t>
+        <w:t>今天学了：ball, balloon, teddy bear, kite, robot, top；句子 What is it? It's a ___. / Is it a…? Yes, it is. / No, it isn't.；字母声音 B = /b/，T = /t/；绘本《Toys》。</w:t>
       </w:r>
     </w:p>
     <w:p>

</xml_diff>